<commit_message>
Fill repository URL, Zenodo DOI and author name throughout manuscript and repo metadata
</commit_message>
<xml_diff>
--- a/jbi_submission/JBI_Declarations.docx
+++ b/jbi_submission/JBI_Declarations.docx
@@ -49,17 +49,7 @@
     </w:p>
     <w:p>
       <w:r>
-        <w:t>[Author 1]: Conceptualization, Methodology, Software, Formal analysis, Writing - original draft.</w:t>
-      </w:r>
-    </w:p>
-    <w:p>
-      <w:r>
-        <w:t>[Author 2]: Validation, Investigation, Data curation, Writing - review and editing.</w:t>
-      </w:r>
-    </w:p>
-    <w:p>
-      <w:r>
-        <w:t>[Author 3]: Supervision, Project administration, Writing - review and editing.</w:t>
+        <w:t>Zhongyuan Liu: Conceptualization, Methodology, Software, Formal analysis, Validation, Investigation, Data curation, Writing - original draft, Writing - review and editing.</w:t>
       </w:r>
     </w:p>
     <w:p>
@@ -87,7 +77,7 @@
     </w:p>
     <w:p>
       <w:r>
-        <w:t>All source cohorts are public GEO series: GSE70362, GSE23130, GSE186542, GSE167199, GSE146904 and GSE207176. Derived analysis tables and the audit code are available at [repository URL and DOI]. The manuscript uses no private patient-level data.</w:t>
+        <w:t>All source cohorts are public GEO series: GSE70362, GSE23130, GSE186542, GSE167199, GSE146904 and GSE207176. Derived analysis tables and the audit code are available at https://github.com/wdsve/ivd-repro-audit and archived at https://doi.org/10.5281/zenodo.23133983. The manuscript uses no private patient-level data.</w:t>
       </w:r>
     </w:p>
     <w:p>

</xml_diff>